<commit_message>
Add 国士舘 AO past exams (R7-R8) and re-mark both students against real prompts
Co-Authored-By: Claude Opus 5.5 <noreply@anthropic.com>
Claude-Session: https://claude.ai/code/session_01ETV8E6rMJUMqstoaV1RYSL
</commit_message>
<xml_diff>
--- a/小論文添削（ショー）/添削結果/石川陽太/20261017_石川陽太_国士舘大学_文学部_R8_AO1_想像力の使い方.docx
+++ b/小論文添削（ショー）/添削結果/石川陽太/20261017_石川陽太_国士舘大学_文学部_R8_AO1_想像力の使い方.docx
@@ -145,7 +145,7 @@
                 <w:color w:val="23301F"/>
                 <w:sz w:val="20"/>
               </w:rPr>
-              <w:t>国士舘大学 文学部 教育学科 総合型選抜（R8 AOⅠ期 過去問）</w:t>
+              <w:t>国士舘大学 文学部 教育学科 総合型選抜 令和8年度 Ⅰ期（10月24日）</w:t>
             </w:r>
           </w:p>
         </w:tc>
@@ -191,7 +191,7 @@
                 <w:color w:val="23301F"/>
                 <w:sz w:val="20"/>
               </w:rPr>
-              <w:t>想像力の使い方</w:t>
+              <w:t>想像力の使い方　／　燃え殻『ブルー ハワイ』</w:t>
             </w:r>
           </w:p>
         </w:tc>
@@ -237,7 +237,7 @@
                 <w:color w:val="23301F"/>
                 <w:sz w:val="20"/>
               </w:rPr>
-              <w:t>（推定）課題文の筆者の「想像力の使い方」についての考えを要約し、あなたの意見を述べなさい。</w:t>
+              <w:t>筆者の「想像力の使い方」に関する主張を要約し、それに対するあなたの考えを600字で述べなさい。</w:t>
             </w:r>
           </w:p>
         </w:tc>
@@ -805,7 +805,7 @@
           <w:color w:val="23301F"/>
           <w:sz w:val="21"/>
         </w:rPr>
-        <w:t>【前提】設問文と字数は未確認のため、字数は解説サイトの「600字程度」を想定し、設問は答案から推定した。課題文を読み取り、賛成の立場をはっきり示せている点は良い。一方で、理由が課題文の言い換えで終わり、自分の体験や教育とのつながりがないため、内容が薄く見える。結論の段落を必ず置き、「教員として子どもたちが一緒に過ごせる場をつくりたい」と教育学科の学びに結べば、答案の芯ができる。</w:t>
+        <w:t>【前提】設問文と字数（600字）は大学公式の過去問で確認した。課題文を読み取り、賛成の立場をはっきり示せている点は良い。一方で、理由が課題文の言い換えで終わり、自分の体験や教育とのつながりがないため、内容が薄く見える。結論の段落を必ず置き、「教員として子どもたちが一緒に過ごせる場をつくりたい」と教育学科の学びに結べば、答案の芯ができる。</w:t>
       </w:r>
     </w:p>
     <w:p>

</xml_diff>

<commit_message>
Re-mark 石川陽太's four answers with the missing second pages
Co-Authored-By: Claude Opus 5.5 <noreply@anthropic.com>
Claude-Session: https://claude.ai/code/session_01ETV8E6rMJUMqstoaV1RYSL
</commit_message>
<xml_diff>
--- a/小論文添削（ショー）/添削結果/石川陽太/20261017_石川陽太_国士舘大学_文学部_R8_AO1_想像力の使い方.docx
+++ b/小論文添削（ショー）/添削結果/石川陽太/20261017_石川陽太_国士舘大学_文学部_R8_AO1_想像力の使い方.docx
@@ -283,7 +283,7 @@
                 <w:color w:val="23301F"/>
                 <w:sz w:val="20"/>
               </w:rPr>
-              <w:t>制限 600字以内　→　答案 314字（9割（540字）に届いていない）</w:t>
+              <w:t>制限 600字以内　→　答案 538字（9割（540字）に届いていない）</w:t>
             </w:r>
           </w:p>
         </w:tc>
@@ -332,7 +332,7 @@
           <w:color w:val="D9782D"/>
           <w:sz w:val="56"/>
         </w:rPr>
-        <w:t>52</w:t>
+        <w:t>61</w:t>
       </w:r>
       <w:r>
         <w:rPr>
@@ -480,7 +480,7 @@
                 <w:color w:val="D9782D"/>
                 <w:sz w:val="22"/>
               </w:rPr>
-              <w:t>13 / 20</w:t>
+              <w:t>14 / 20</w:t>
             </w:r>
           </w:p>
         </w:tc>
@@ -501,7 +501,7 @@
                 <w:color w:val="23301F"/>
                 <w:sz w:val="19"/>
               </w:rPr>
-              <w:t>要約と賛否は示せている。ただ理由が課題文の中身（宗教・家の事情）の言い換えにとどまり、「想像力をどう使うべきか」への自分の答えが弱い。</w:t>
+              <w:t>要約と賛成の立場、体験、結論がそろい、設問には答えている。ただ理由①②が課題文の内容の言い換えにとどまり、「想像力をどう使うべきか」という自分の考えが弱い。</w:t>
             </w:r>
           </w:p>
         </w:tc>
@@ -546,7 +546,7 @@
                 <w:color w:val="D9782D"/>
                 <w:sz w:val="22"/>
               </w:rPr>
-              <w:t>11 / 20</w:t>
+              <w:t>14 / 20</w:t>
             </w:r>
           </w:p>
         </w:tc>
@@ -567,7 +567,7 @@
                 <w:color w:val="23301F"/>
                 <w:sz w:val="19"/>
               </w:rPr>
-              <w:t>要約→賛成→理由2つの形は良い。結論の段落がなく、理由②「子どもの人生だから大人が思うことをやらせる必要はない」は主張とのつながりが薄い。</w:t>
+              <w:t>要約→賛成→理由2つ→体験→結論の形は良い。理由②「子どもの人生なのだから大人が思うことをやらせる必要がない」は主張からずれている。体験の段落と理由の段落のつながりも示したい。</w:t>
             </w:r>
           </w:p>
         </w:tc>
@@ -612,7 +612,7 @@
                 <w:color w:val="D9782D"/>
                 <w:sz w:val="22"/>
               </w:rPr>
-              <w:t>9 / 20</w:t>
+              <w:t>13 / 20</w:t>
             </w:r>
           </w:p>
         </w:tc>
@@ -633,7 +633,7 @@
                 <w:color w:val="23301F"/>
                 <w:sz w:val="19"/>
               </w:rPr>
-              <w:t>自分の体験や具体的な場面が一つもない。小学校時代など、身近な例を一つ入れると説得力が大きく上がる。</w:t>
+              <w:t>「この家には近づいてはいけない」と大人が言った話を聞いた体験は、課題文の内容とぴったり重なる良い具体例。人から聞いた話なので、自分がどう感じたか（かわいそうで残酷）まで書けている点も良い。</w:t>
             </w:r>
           </w:p>
         </w:tc>
@@ -678,7 +678,7 @@
                 <w:color w:val="D9782D"/>
                 <w:sz w:val="22"/>
               </w:rPr>
-              <w:t>8 / 20</w:t>
+              <w:t>9 / 20</w:t>
             </w:r>
           </w:p>
         </w:tc>
@@ -699,7 +699,7 @@
                 <w:color w:val="23301F"/>
                 <w:sz w:val="19"/>
               </w:rPr>
-              <w:t>教育学科なのに、教育や教員の役割への言及がない。「子どもが一緒に過ごせる場をつくる」ことは教育そのものなので、最後に必ずつなげたい。</w:t>
+              <w:t>結論が「『いま』を楽しむことが大切」で終わり、教育や教員の役割に一度も触れていない。教育学科の志望理由につながる一文がほしい。</w:t>
             </w:r>
           </w:p>
         </w:tc>
@@ -765,7 +765,7 @@
                 <w:color w:val="23301F"/>
                 <w:sz w:val="19"/>
               </w:rPr>
-              <w:t>だ・である調はほぼ統一できている。「〜べきだ」「〜関係がない」など文末がやや強い。字数は314字で、600字程度なら半分ほど（後半があるか要確認）。</w:t>
+              <w:t>538字で、600字の9割（540字）にわずかに届かない。「ものすごく」は話し言葉。「関わらず」は「かかわらず」。大人の発言の引用がかぎかっこなしで、文が混ざっている。</w:t>
             </w:r>
           </w:p>
         </w:tc>
@@ -805,7 +805,7 @@
           <w:color w:val="23301F"/>
           <w:sz w:val="21"/>
         </w:rPr>
-        <w:t>【前提】設問文と字数（600字）は大学公式の過去問で確認した。課題文を読み取り、賛成の立場をはっきり示せている点は良い。一方で、理由が課題文の言い換えで終わり、自分の体験や教育とのつながりがないため、内容が薄く見える。結論の段落を必ず置き、「教員として子どもたちが一緒に過ごせる場をつくりたい」と教育学科の学びに結べば、答案の芯ができる。</w:t>
+        <w:t>【前提】設問文と字数（600字）は大学公式の過去問で確認した。続きのページを含む全文で評価した。要約・賛成・理由・体験・結論の流れがそろい、課題文と重なる体験（大人の事情で遊びを禁じられた子の話）を書けた点がとても良い。課題は二つ。一つは、理由が課題文の言い換えにとどまっていること。「違いより一緒に過ごす経験が相手を受け入れる力になる」のように、自分の言葉で理由を書きたい。もう一つは、結論が教育学科とつながっていないこと。「どの子も一緒に過ごせる学級をつくりたい」と教員の視点で締めれば、志望理由の伝わる答案になる。</w:t>
       </w:r>
     </w:p>
     <w:p>
@@ -876,7 +876,7 @@
           <w:color w:val="23301F"/>
           <w:sz w:val="21"/>
         </w:rPr>
-        <w:t>「賛成する」と自分の立場を早い段階ではっきり示している</w:t>
+        <w:t>大人の事情で遊びを禁じられた子の話という、課題文と重なる体験を書けている</w:t>
       </w:r>
     </w:p>
     <w:p>
@@ -900,7 +900,31 @@
           <w:color w:val="23301F"/>
           <w:sz w:val="21"/>
         </w:rPr>
-        <w:t>「理由は二つある」と予告してから書いており、読み手が迷わない</w:t>
+        <w:t>体験について「かわいそうで残酷だと感じた」と、自分の気持ちまで書けている</w:t>
+      </w:r>
+    </w:p>
+    <w:p>
+      <w:pPr>
+        <w:spacing w:after="40" w:before="0" w:line="300" w:lineRule="auto"/>
+        <w:ind w:left="227" w:hanging="227"/>
+      </w:pPr>
+      <w:r>
+        <w:rPr>
+          <w:rFonts w:ascii="游ゴシック" w:hAnsi="游ゴシック" w:eastAsia="游ゴシック"/>
+          <w:b/>
+          <w:color w:val="2C5F2D"/>
+          <w:sz w:val="21"/>
+        </w:rPr>
+        <w:t xml:space="preserve">✓ </w:t>
+      </w:r>
+      <w:r>
+        <w:rPr>
+          <w:rFonts w:ascii="游ゴシック" w:hAnsi="游ゴシック" w:eastAsia="游ゴシック"/>
+          <w:b w:val="0"/>
+          <w:color w:val="23301F"/>
+          <w:sz w:val="21"/>
+        </w:rPr>
+        <w:t>最後に賛成の立場をもう一度示し、結論の段落を置けている</w:t>
       </w:r>
     </w:p>
     <w:p>
@@ -937,69 +961,7 @@
           <w:color w:val="17321A"/>
           <w:sz w:val="21"/>
         </w:rPr>
-        <w:t>1. 結論の段落を必ず書く</w:t>
-      </w:r>
-    </w:p>
-    <w:p>
-      <w:pPr>
-        <w:spacing w:after="20" w:before="0" w:line="300" w:lineRule="auto"/>
-        <w:ind w:left="283"/>
-      </w:pPr>
-      <w:r>
-        <w:rPr>
-          <w:rFonts w:ascii="游ゴシック" w:hAnsi="游ゴシック" w:eastAsia="游ゴシック"/>
-          <w:b/>
-          <w:color w:val="5B6B54"/>
-          <w:sz w:val="19"/>
-        </w:rPr>
-        <w:t>答案：</w:t>
-      </w:r>
-      <w:r>
-        <w:rPr>
-          <w:rFonts w:ascii="游明朝" w:hAnsi="游明朝" w:eastAsia="游明朝"/>
-          <w:b w:val="0"/>
-          <w:color w:val="5B6B54"/>
-          <w:sz w:val="19"/>
-        </w:rPr>
-        <w:t>「子どもの人生なのだから大人が思うことをやらせる必要がないと考えるからだ。」</w:t>
-      </w:r>
-    </w:p>
-    <w:p>
-      <w:pPr>
-        <w:spacing w:after="40" w:before="0" w:line="300" w:lineRule="auto"/>
-        <w:ind w:left="283"/>
-      </w:pPr>
-      <w:r>
-        <w:rPr>
-          <w:rFonts w:ascii="游ゴシック" w:hAnsi="游ゴシック" w:eastAsia="游ゴシック"/>
-          <w:b/>
-          <w:color w:val="D9782D"/>
-          <w:sz w:val="21"/>
-        </w:rPr>
-        <w:t xml:space="preserve">→ </w:t>
-      </w:r>
-      <w:r>
-        <w:rPr>
-          <w:rFonts w:ascii="游ゴシック" w:hAnsi="游ゴシック" w:eastAsia="游ゴシック"/>
-          <w:b w:val="0"/>
-          <w:color w:val="23301F"/>
-          <w:sz w:val="21"/>
-        </w:rPr>
-        <w:t>理由で終わっている。「以上より、想像力は〜に使うべきである」と主張をもう一度まとめ、教育学科での学びにつなげる段落を足す。</w:t>
-      </w:r>
-    </w:p>
-    <w:p>
-      <w:pPr>
-        <w:spacing w:after="20" w:before="60" w:line="300" w:lineRule="auto"/>
-      </w:pPr>
-      <w:r>
-        <w:rPr>
-          <w:rFonts w:ascii="游ゴシック" w:hAnsi="游ゴシック" w:eastAsia="游ゴシック"/>
-          <w:b/>
-          <w:color w:val="17321A"/>
-          <w:sz w:val="21"/>
-        </w:rPr>
-        <w:t>2. 理由を「自分の考え」にする</w:t>
+        <w:t>1. 理由を自分の言葉で書く</w:t>
       </w:r>
     </w:p>
     <w:p>
@@ -1047,7 +1009,7 @@
           <w:color w:val="23301F"/>
           <w:sz w:val="21"/>
         </w:rPr>
-        <w:t>課題文の内容の繰り返しになっている。「違いを意識するより一緒に楽しむ経験が、相手を受け入れる力になる」のように、なぜそう言えるのかを自分の言葉で書く。</w:t>
+        <w:t>課題文の内容の繰り返しになっている。「違いを意識しすぎると壁ができる。一緒に過ごす経験こそが相手を受け入れる力になる」のように、なぜそう言えるのかを自分の言葉で書く。</w:t>
       </w:r>
     </w:p>
     <w:p>
@@ -1061,7 +1023,31 @@
           <w:color w:val="17321A"/>
           <w:sz w:val="21"/>
         </w:rPr>
-        <w:t>3. 自分の体験を一つ入れる</w:t>
+        <w:t>2. 理由②を主張とつなげ、体験と結びつける</w:t>
+      </w:r>
+    </w:p>
+    <w:p>
+      <w:pPr>
+        <w:spacing w:after="20" w:before="0" w:line="300" w:lineRule="auto"/>
+        <w:ind w:left="283"/>
+      </w:pPr>
+      <w:r>
+        <w:rPr>
+          <w:rFonts w:ascii="游ゴシック" w:hAnsi="游ゴシック" w:eastAsia="游ゴシック"/>
+          <w:b/>
+          <w:color w:val="5B6B54"/>
+          <w:sz w:val="19"/>
+        </w:rPr>
+        <w:t>答案：</w:t>
+      </w:r>
+      <w:r>
+        <w:rPr>
+          <w:rFonts w:ascii="游明朝" w:hAnsi="游明朝" w:eastAsia="游明朝"/>
+          <w:b w:val="0"/>
+          <w:color w:val="5B6B54"/>
+          <w:sz w:val="19"/>
+        </w:rPr>
+        <w:t>「また、子どもの人生なのだから大人が思うことをやらせる必要がないと考えるからだ。」</w:t>
       </w:r>
     </w:p>
     <w:p>
@@ -1085,7 +1071,7 @@
           <w:color w:val="23301F"/>
           <w:sz w:val="21"/>
         </w:rPr>
-        <w:t>小学校や部活動で、違いのある友だちと一緒に過ごした経験があれば一文でよいので入れる。教育学部系の小論文では体験が強い根拠になる。</w:t>
+        <w:t>この文は「想像力の使い方」から話がずれている。理由②は「大人の事情が子どもの関係を壊してしまう」とし、すぐ後の体験（遊ぶのを禁じられた子の話）をその根拠として続けると、段落がつながる。</w:t>
       </w:r>
     </w:p>
     <w:p>
@@ -1099,7 +1085,7 @@
           <w:color w:val="17321A"/>
           <w:sz w:val="21"/>
         </w:rPr>
-        <w:t>4. 理由②を主張とつなげる</w:t>
+        <w:t>3. 結論を教育学科での学びにつなげる</w:t>
       </w:r>
     </w:p>
     <w:p>
@@ -1123,7 +1109,7 @@
           <w:color w:val="5B6B54"/>
           <w:sz w:val="19"/>
         </w:rPr>
-        <w:t>「二つ目は、大人の事情があったとしても、それは別に子どもの世界には関係がない。」</w:t>
+        <w:t>「大人の難しい事情を考えることよりも、「いま」を楽しむことがものすごく大切だと考える。」</w:t>
       </w:r>
     </w:p>
     <w:p>
@@ -1147,7 +1133,69 @@
           <w:color w:val="23301F"/>
           <w:sz w:val="21"/>
         </w:rPr>
-        <w:t>「大人の事情を持ち込むと、子どもは人を立場で判断することを覚えてしまう」のように、なぜ関係がないと言えるのかを補う。</w:t>
+        <w:t>教育学科の小論文なので、「私は教育学科で学び、事情の違いに関係なく、どの子も一緒に過ごせる学級をつくれる教員になりたい」のように、教員としての目標で締める。</w:t>
+      </w:r>
+    </w:p>
+    <w:p>
+      <w:pPr>
+        <w:spacing w:after="20" w:before="60" w:line="300" w:lineRule="auto"/>
+      </w:pPr>
+      <w:r>
+        <w:rPr>
+          <w:rFonts w:ascii="游ゴシック" w:hAnsi="游ゴシック" w:eastAsia="游ゴシック"/>
+          <w:b/>
+          <w:color w:val="17321A"/>
+          <w:sz w:val="21"/>
+        </w:rPr>
+        <w:t>4. 引用はかぎかっこでくくる</w:t>
+      </w:r>
+    </w:p>
+    <w:p>
+      <w:pPr>
+        <w:spacing w:after="20" w:before="0" w:line="300" w:lineRule="auto"/>
+        <w:ind w:left="283"/>
+      </w:pPr>
+      <w:r>
+        <w:rPr>
+          <w:rFonts w:ascii="游ゴシック" w:hAnsi="游ゴシック" w:eastAsia="游ゴシック"/>
+          <w:b/>
+          <w:color w:val="5B6B54"/>
+          <w:sz w:val="19"/>
+        </w:rPr>
+        <w:t>答案：</w:t>
+      </w:r>
+      <w:r>
+        <w:rPr>
+          <w:rFonts w:ascii="游明朝" w:hAnsi="游明朝" w:eastAsia="游明朝"/>
+          <w:b w:val="0"/>
+          <w:color w:val="5B6B54"/>
+          <w:sz w:val="19"/>
+        </w:rPr>
+        <w:t>「この家は宗教的に近づいてはいけない。遊んではいけないよと大人が子どもに言った」</w:t>
+      </w:r>
+    </w:p>
+    <w:p>
+      <w:pPr>
+        <w:spacing w:after="40" w:before="0" w:line="300" w:lineRule="auto"/>
+        <w:ind w:left="283"/>
+      </w:pPr>
+      <w:r>
+        <w:rPr>
+          <w:rFonts w:ascii="游ゴシック" w:hAnsi="游ゴシック" w:eastAsia="游ゴシック"/>
+          <w:b/>
+          <w:color w:val="D9782D"/>
+          <w:sz w:val="21"/>
+        </w:rPr>
+        <w:t xml:space="preserve">→ </w:t>
+      </w:r>
+      <w:r>
+        <w:rPr>
+          <w:rFonts w:ascii="游ゴシック" w:hAnsi="游ゴシック" w:eastAsia="游ゴシック"/>
+          <w:b w:val="0"/>
+          <w:color w:val="23301F"/>
+          <w:sz w:val="21"/>
+        </w:rPr>
+        <w:t>人の発言を文の中に入れるときは「あの家には近づいてはいけない、遊んではいけない」とかぎかっこでくくると、誰の言葉かがはっきりする。</w:t>
       </w:r>
     </w:p>
     <w:p>
@@ -1170,7 +1218,7 @@
           <w:color w:val="2C5F2D"/>
           <w:sz w:val="26"/>
         </w:rPr>
-        <w:t>あなたの答案（314字）</w:t>
+        <w:t>あなたの答案（538字）</w:t>
       </w:r>
     </w:p>
     <w:tbl>
@@ -1218,7 +1266,7 @@
                 <w:color w:val="2C5F2D"/>
                 <w:sz w:val="19"/>
               </w:rPr>
-              <w:t>第1段落</w:t>
+              <w:t>序論</w:t>
             </w:r>
           </w:p>
           <w:p>
@@ -1278,7 +1326,7 @@
                 <w:color w:val="2C5F2D"/>
                 <w:sz w:val="19"/>
               </w:rPr>
-              <w:t>第2段落</w:t>
+              <w:t>主張</w:t>
             </w:r>
           </w:p>
           <w:p>
@@ -1338,7 +1386,7 @@
                 <w:color w:val="2C5F2D"/>
                 <w:sz w:val="19"/>
               </w:rPr>
-              <w:t>第3段落</w:t>
+              <w:t>本論①</w:t>
             </w:r>
           </w:p>
           <w:p>
@@ -1374,6 +1422,126 @@
                 <w:sz w:val="21"/>
               </w:rPr>
               <w:t>そう考える理由は二つある。一つ目は、小学生なのだから宗教や家がお寺などということを深く考えず、仲良く遊んだ方が良いと考えるからである。加えて、そのようなことに想像力を使うよりも、他のことに考えを巡らせるべきだ。二つ目は、大人の事情があったとしても、それは別に子どもの世界には関係がない。また、子どもの人生なのだから大人が思うことをやらせる必要がないと考えるからだ。</w:t>
+            </w:r>
+          </w:p>
+        </w:tc>
+      </w:tr>
+      <w:tr>
+        <w:tc>
+          <w:tcPr>
+            <w:tcW w:type="dxa" w:w="1361"/>
+            <w:shd w:val="clear" w:color="auto" w:fill="F6F8F3"/>
+            <w:vAlign w:val="center"/>
+          </w:tcPr>
+          <w:p>
+            <w:pPr>
+              <w:spacing w:after="0" w:line="288" w:lineRule="auto"/>
+              <w:jc w:val="center"/>
+            </w:pPr>
+            <w:r/>
+            <w:r>
+              <w:rPr>
+                <w:rFonts w:ascii="游ゴシック" w:hAnsi="游ゴシック" w:eastAsia="游ゴシック"/>
+                <w:b/>
+                <w:color w:val="2C5F2D"/>
+                <w:sz w:val="19"/>
+              </w:rPr>
+              <w:t>本論②</w:t>
+            </w:r>
+          </w:p>
+          <w:p>
+            <w:pPr>
+              <w:spacing w:after="0" w:line="288" w:lineRule="auto"/>
+            </w:pPr>
+            <w:r>
+              <w:rPr>
+                <w:rFonts w:ascii="游ゴシック" w:hAnsi="游ゴシック" w:eastAsia="游ゴシック"/>
+                <w:b/>
+                <w:color w:val="2C5F2D"/>
+                <w:sz w:val="19"/>
+              </w:rPr>
+              <w:t>150字</w:t>
+            </w:r>
+          </w:p>
+        </w:tc>
+        <w:tc>
+          <w:tcPr>
+            <w:tcW w:type="dxa" w:w="8277"/>
+            <w:vAlign w:val="center"/>
+          </w:tcPr>
+          <w:p>
+            <w:pPr>
+              <w:spacing w:after="0" w:line="288" w:lineRule="auto"/>
+            </w:pPr>
+            <w:r/>
+            <w:r>
+              <w:rPr>
+                <w:rFonts w:ascii="游明朝" w:hAnsi="游明朝" w:eastAsia="游明朝"/>
+                <w:b w:val="0"/>
+                <w:color w:val="23301F"/>
+                <w:sz w:val="21"/>
+              </w:rPr>
+              <w:t>私が小学生くらいの頃、この家は宗教的に近づいてはいけない。遊んではいけないよと大人が子どもに言ったということを聞いたことがあった。ダメと言われた子どもは、一緒に遊びたかったにも関わらず制限をされていた。その頃の私は、親の宗教のせいで子どもを巻き込んでしまい、なんてかわいそうで残酷なんだろうと感じた。</w:t>
+            </w:r>
+          </w:p>
+        </w:tc>
+      </w:tr>
+      <w:tr>
+        <w:tc>
+          <w:tcPr>
+            <w:tcW w:type="dxa" w:w="1361"/>
+            <w:shd w:val="clear" w:color="auto" w:fill="F6F8F3"/>
+            <w:vAlign w:val="center"/>
+          </w:tcPr>
+          <w:p>
+            <w:pPr>
+              <w:spacing w:after="0" w:line="288" w:lineRule="auto"/>
+              <w:jc w:val="center"/>
+            </w:pPr>
+            <w:r/>
+            <w:r>
+              <w:rPr>
+                <w:rFonts w:ascii="游ゴシック" w:hAnsi="游ゴシック" w:eastAsia="游ゴシック"/>
+                <w:b/>
+                <w:color w:val="2C5F2D"/>
+                <w:sz w:val="19"/>
+              </w:rPr>
+              <w:t>結論</w:t>
+            </w:r>
+          </w:p>
+          <w:p>
+            <w:pPr>
+              <w:spacing w:after="0" w:line="288" w:lineRule="auto"/>
+            </w:pPr>
+            <w:r>
+              <w:rPr>
+                <w:rFonts w:ascii="游ゴシック" w:hAnsi="游ゴシック" w:eastAsia="游ゴシック"/>
+                <w:b/>
+                <w:color w:val="2C5F2D"/>
+                <w:sz w:val="19"/>
+              </w:rPr>
+              <w:t>74字</w:t>
+            </w:r>
+          </w:p>
+        </w:tc>
+        <w:tc>
+          <w:tcPr>
+            <w:tcW w:type="dxa" w:w="8277"/>
+            <w:vAlign w:val="center"/>
+          </w:tcPr>
+          <w:p>
+            <w:pPr>
+              <w:spacing w:after="0" w:line="288" w:lineRule="auto"/>
+            </w:pPr>
+            <w:r/>
+            <w:r>
+              <w:rPr>
+                <w:rFonts w:ascii="游明朝" w:hAnsi="游明朝" w:eastAsia="游明朝"/>
+                <w:b w:val="0"/>
+                <w:color w:val="23301F"/>
+                <w:sz w:val="21"/>
+              </w:rPr>
+              <w:t>以上のことから、私は筆者の「想像力の使い方」について賛成である。大人の難しい事情を考えることよりも、「いま」を楽しむことがものすごく大切だと考える。</w:t>
             </w:r>
           </w:p>
         </w:tc>
@@ -1516,71 +1684,6 @@
                 <w:color w:val="23301F"/>
                 <w:sz w:val="19"/>
               </w:rPr>
-              <w:t>立場や個性や事情を</w:t>
-            </w:r>
-          </w:p>
-        </w:tc>
-        <w:tc>
-          <w:tcPr>
-            <w:tcW w:type="dxa" w:w="3402"/>
-            <w:vAlign w:val="center"/>
-          </w:tcPr>
-          <w:p>
-            <w:pPr>
-              <w:spacing w:after="0" w:line="288" w:lineRule="auto"/>
-            </w:pPr>
-            <w:r/>
-            <w:r>
-              <w:rPr>
-                <w:rFonts w:ascii="游明朝" w:hAnsi="游明朝" w:eastAsia="游明朝"/>
-                <w:b/>
-                <w:color w:val="2C5F2D"/>
-                <w:sz w:val="19"/>
-              </w:rPr>
-              <w:t>立場や個性、事情を</w:t>
-            </w:r>
-          </w:p>
-        </w:tc>
-        <w:tc>
-          <w:tcPr>
-            <w:tcW w:type="dxa" w:w="2835"/>
-            <w:vAlign w:val="center"/>
-          </w:tcPr>
-          <w:p>
-            <w:pPr>
-              <w:spacing w:after="0" w:line="288" w:lineRule="auto"/>
-            </w:pPr>
-            <w:r/>
-            <w:r>
-              <w:rPr>
-                <w:rFonts w:ascii="游ゴシック" w:hAnsi="游ゴシック" w:eastAsia="游ゴシック"/>
-                <w:b w:val="0"/>
-                <w:color w:val="23301F"/>
-                <w:sz w:val="18"/>
-              </w:rPr>
-              <w:t>「や」の重ねすぎを避ける</w:t>
-            </w:r>
-          </w:p>
-        </w:tc>
-      </w:tr>
-      <w:tr>
-        <w:tc>
-          <w:tcPr>
-            <w:tcW w:type="dxa" w:w="3402"/>
-            <w:vAlign w:val="center"/>
-          </w:tcPr>
-          <w:p>
-            <w:pPr>
-              <w:spacing w:after="0" w:line="288" w:lineRule="auto"/>
-            </w:pPr>
-            <w:r/>
-            <w:r>
-              <w:rPr>
-                <w:rFonts w:ascii="游明朝" w:hAnsi="游明朝" w:eastAsia="游明朝"/>
-                <w:b w:val="0"/>
-                <w:color w:val="23301F"/>
-                <w:sz w:val="19"/>
-              </w:rPr>
               <w:t>「いま」を一緒に味わうことを考えている。</w:t>
             </w:r>
           </w:p>
@@ -1602,7 +1705,7 @@
                 <w:color w:val="2C5F2D"/>
                 <w:sz w:val="19"/>
               </w:rPr>
-              <w:t>「いま」を一緒に味わうことに使うべきだと考えている。</w:t>
+              <w:t>「いま」を一緒に味わうことに想像力を使いたいと述べている。</w:t>
             </w:r>
           </w:p>
         </w:tc>
@@ -1623,7 +1726,7 @@
                 <w:color w:val="23301F"/>
                 <w:sz w:val="18"/>
               </w:rPr>
-              <w:t>何を考えているのかが曖昧。主張の形にする</w:t>
+              <w:t>何を考えているのかが曖昧。筆者の主張の形にする</w:t>
             </w:r>
           </w:p>
         </w:tc>
@@ -1688,7 +1791,7 @@
                 <w:color w:val="23301F"/>
                 <w:sz w:val="18"/>
               </w:rPr>
-              <w:t>並べる言葉の種類をそろえる（人と属性が混在）</w:t>
+              <w:t>並べる言葉の種類をそろえる</w:t>
             </w:r>
           </w:p>
         </w:tc>
@@ -1776,7 +1879,7 @@
                 <w:color w:val="23301F"/>
                 <w:sz w:val="19"/>
               </w:rPr>
-              <w:t>それは別に子どもの世界には関係がない。</w:t>
+              <w:t>一緒に遊びたかったにも関わらず制限をされていた。</w:t>
             </w:r>
           </w:p>
         </w:tc>
@@ -1797,7 +1900,7 @@
                 <w:color w:val="2C5F2D"/>
                 <w:sz w:val="19"/>
               </w:rPr>
-              <w:t>それを子どもの世界に持ち込むべきではない。</w:t>
+              <w:t>一緒に遊びたかったにもかかわらず、それができなかった。</w:t>
             </w:r>
           </w:p>
         </w:tc>
@@ -1818,7 +1921,137 @@
                 <w:color w:val="23301F"/>
                 <w:sz w:val="18"/>
               </w:rPr>
-              <w:t>「別に」は話し言葉。理由の文の形（〜からである）にもそろえる</w:t>
+              <w:t>「にもかかわらず」はひらがな。「制限をされていた」は硬く不自然</w:t>
+            </w:r>
+          </w:p>
+        </w:tc>
+      </w:tr>
+      <w:tr>
+        <w:tc>
+          <w:tcPr>
+            <w:tcW w:type="dxa" w:w="3402"/>
+            <w:vAlign w:val="center"/>
+          </w:tcPr>
+          <w:p>
+            <w:pPr>
+              <w:spacing w:after="0" w:line="288" w:lineRule="auto"/>
+            </w:pPr>
+            <w:r/>
+            <w:r>
+              <w:rPr>
+                <w:rFonts w:ascii="游明朝" w:hAnsi="游明朝" w:eastAsia="游明朝"/>
+                <w:b w:val="0"/>
+                <w:color w:val="23301F"/>
+                <w:sz w:val="19"/>
+              </w:rPr>
+              <w:t>なんてかわいそうで残酷なんだろうと感じた。</w:t>
+            </w:r>
+          </w:p>
+        </w:tc>
+        <w:tc>
+          <w:tcPr>
+            <w:tcW w:type="dxa" w:w="3402"/>
+            <w:vAlign w:val="center"/>
+          </w:tcPr>
+          <w:p>
+            <w:pPr>
+              <w:spacing w:after="0" w:line="288" w:lineRule="auto"/>
+            </w:pPr>
+            <w:r/>
+            <w:r>
+              <w:rPr>
+                <w:rFonts w:ascii="游明朝" w:hAnsi="游明朝" w:eastAsia="游明朝"/>
+                <w:b/>
+                <w:color w:val="2C5F2D"/>
+                <w:sz w:val="19"/>
+              </w:rPr>
+              <w:t>とてもかわいそうで残酷だと感じた。</w:t>
+            </w:r>
+          </w:p>
+        </w:tc>
+        <w:tc>
+          <w:tcPr>
+            <w:tcW w:type="dxa" w:w="2835"/>
+            <w:vAlign w:val="center"/>
+          </w:tcPr>
+          <w:p>
+            <w:pPr>
+              <w:spacing w:after="0" w:line="288" w:lineRule="auto"/>
+            </w:pPr>
+            <w:r/>
+            <w:r>
+              <w:rPr>
+                <w:rFonts w:ascii="游ゴシック" w:hAnsi="游ゴシック" w:eastAsia="游ゴシック"/>
+                <w:b w:val="0"/>
+                <w:color w:val="23301F"/>
+                <w:sz w:val="18"/>
+              </w:rPr>
+              <w:t>「なんて〜なんだろう」は話し言葉</w:t>
+            </w:r>
+          </w:p>
+        </w:tc>
+      </w:tr>
+      <w:tr>
+        <w:tc>
+          <w:tcPr>
+            <w:tcW w:type="dxa" w:w="3402"/>
+            <w:vAlign w:val="center"/>
+          </w:tcPr>
+          <w:p>
+            <w:pPr>
+              <w:spacing w:after="0" w:line="288" w:lineRule="auto"/>
+            </w:pPr>
+            <w:r/>
+            <w:r>
+              <w:rPr>
+                <w:rFonts w:ascii="游明朝" w:hAnsi="游明朝" w:eastAsia="游明朝"/>
+                <w:b w:val="0"/>
+                <w:color w:val="23301F"/>
+                <w:sz w:val="19"/>
+              </w:rPr>
+              <w:t>ものすごく大切だと考える。</w:t>
+            </w:r>
+          </w:p>
+        </w:tc>
+        <w:tc>
+          <w:tcPr>
+            <w:tcW w:type="dxa" w:w="3402"/>
+            <w:vAlign w:val="center"/>
+          </w:tcPr>
+          <w:p>
+            <w:pPr>
+              <w:spacing w:after="0" w:line="288" w:lineRule="auto"/>
+            </w:pPr>
+            <w:r/>
+            <w:r>
+              <w:rPr>
+                <w:rFonts w:ascii="游明朝" w:hAnsi="游明朝" w:eastAsia="游明朝"/>
+                <w:b/>
+                <w:color w:val="2C5F2D"/>
+                <w:sz w:val="19"/>
+              </w:rPr>
+              <w:t>何より大切だと考える。</w:t>
+            </w:r>
+          </w:p>
+        </w:tc>
+        <w:tc>
+          <w:tcPr>
+            <w:tcW w:type="dxa" w:w="2835"/>
+            <w:vAlign w:val="center"/>
+          </w:tcPr>
+          <w:p>
+            <w:pPr>
+              <w:spacing w:after="0" w:line="288" w:lineRule="auto"/>
+            </w:pPr>
+            <w:r/>
+            <w:r>
+              <w:rPr>
+                <w:rFonts w:ascii="游ゴシック" w:hAnsi="游ゴシック" w:eastAsia="游ゴシック"/>
+                <w:b w:val="0"/>
+                <w:color w:val="23301F"/>
+                <w:sz w:val="18"/>
+              </w:rPr>
+              <w:t>「ものすごく」は話し言葉</w:t>
             </w:r>
           </w:p>
         </w:tc>
@@ -1951,7 +2184,7 @@
                 <w:color w:val="23301F"/>
                 <w:sz w:val="19"/>
               </w:rPr>
-              <w:t>【第1段落】要約：想像力は事情を突き詰めるより「いま」を一緒に味わうことに</w:t>
+              <w:t>【序論】要約：事情を突き詰めるより「いま」を一緒に味わう</w:t>
             </w:r>
           </w:p>
         </w:tc>
@@ -1973,7 +2206,7 @@
                 <w:color w:val="23301F"/>
                 <w:sz w:val="19"/>
               </w:rPr>
-              <w:t>【序論】要約：「いま」を一緒に味わう想像力（例：誰もが遊べる場）</w:t>
+              <w:t>【序論】要約：事情を突き詰めるより「いま」を一緒に味わうことに想像力を</w:t>
             </w:r>
           </w:p>
         </w:tc>
@@ -1996,7 +2229,7 @@
                 <w:color w:val="23301F"/>
                 <w:sz w:val="19"/>
               </w:rPr>
-              <w:t>【第2段落】主張：賛成</w:t>
+              <w:t>【主張】賛成</w:t>
             </w:r>
           </w:p>
         </w:tc>
@@ -2041,7 +2274,7 @@
                 <w:color w:val="23301F"/>
                 <w:sz w:val="19"/>
               </w:rPr>
-              <w:t>【第3段落】理由①：小学生は事情を考えず仲良く遊ぶべき／理由②：大人の事情は子どもに関係ない（結論なし）</w:t>
+              <w:t>【本論①】理由①：小学生は事情を考えず仲良く遊ぶべき／理由②：大人の事情は子どもに関係ない（ずれあり）</w:t>
             </w:r>
           </w:p>
         </w:tc>
@@ -2063,7 +2296,7 @@
                 <w:color w:val="23301F"/>
                 <w:sz w:val="19"/>
               </w:rPr>
-              <w:t>【本論①】違いより一緒に楽しむ経験 → 相手を受け入れる力に（体験を一つ）</w:t>
+              <w:t>【本論①】理由①：違いを意識しすぎると壁 → 一緒に過ごす経験が受け入れる力に</w:t>
             </w:r>
           </w:p>
         </w:tc>
@@ -2072,8 +2305,23 @@
         <w:tc>
           <w:tcPr>
             <w:tcW w:type="dxa" w:w="4819"/>
+            <w:vAlign w:val="center"/>
           </w:tcPr>
-          <w:p/>
+          <w:p>
+            <w:pPr>
+              <w:spacing w:after="0" w:line="288" w:lineRule="auto"/>
+            </w:pPr>
+            <w:r/>
+            <w:r>
+              <w:rPr>
+                <w:rFonts w:ascii="游ゴシック" w:hAnsi="游ゴシック" w:eastAsia="游ゴシック"/>
+                <w:b w:val="0"/>
+                <w:color w:val="23301F"/>
+                <w:sz w:val="19"/>
+              </w:rPr>
+              <w:t>【本論②】体験：大人が「あの家と遊ぶな」と言った話 → かわいそうで残酷</w:t>
+            </w:r>
+          </w:p>
         </w:tc>
         <w:tc>
           <w:tcPr>
@@ -2093,7 +2341,7 @@
                 <w:color w:val="23301F"/>
                 <w:sz w:val="19"/>
               </w:rPr>
-              <w:t>【本論②】大人の事情を持ち込むと人を属性で判断するように → 大人は場を整える役</w:t>
+              <w:t>【本論②】理由②：大人の事情が関係を壊す ← 体験：遊ぶのを禁じられた子の話</w:t>
             </w:r>
           </w:p>
         </w:tc>
@@ -2102,8 +2350,23 @@
         <w:tc>
           <w:tcPr>
             <w:tcW w:type="dxa" w:w="4819"/>
+            <w:vAlign w:val="center"/>
           </w:tcPr>
-          <w:p/>
+          <w:p>
+            <w:pPr>
+              <w:spacing w:after="0" w:line="288" w:lineRule="auto"/>
+            </w:pPr>
+            <w:r/>
+            <w:r>
+              <w:rPr>
+                <w:rFonts w:ascii="游ゴシック" w:hAnsi="游ゴシック" w:eastAsia="游ゴシック"/>
+                <w:b w:val="0"/>
+                <w:color w:val="23301F"/>
+                <w:sz w:val="19"/>
+              </w:rPr>
+              <w:t>【結論】賛成（再）→「いま」を楽しむことが大切（教育とのつながりなし）</w:t>
+            </w:r>
+          </w:p>
         </w:tc>
         <w:tc>
           <w:tcPr>
@@ -2123,7 +2386,7 @@
                 <w:color w:val="23301F"/>
                 <w:sz w:val="19"/>
               </w:rPr>
-              <w:t>【結論】想像力は「いま」をつくるために → 教育学科で学級づくりを学び、どの子も安心できる場をつくる教員に</w:t>
+              <w:t>【結論】想像力は「いま」をつくるために → 教育学科で学び、どの子も一緒に過ごせる学級をつくる教員に</w:t>
             </w:r>
           </w:p>
         </w:tc>
@@ -2149,7 +2412,7 @@
           <w:color w:val="2C5F2D"/>
           <w:sz w:val="26"/>
         </w:rPr>
-        <w:t>書き直し例（554字）</w:t>
+        <w:t>書き直し例（559字）</w:t>
       </w:r>
     </w:p>
     <w:p>
@@ -2225,7 +2488,7 @@
                 <w:color w:val="2C5F2D"/>
                 <w:sz w:val="19"/>
               </w:rPr>
-              <w:t>120字</w:t>
+              <w:t>112字</w:t>
             </w:r>
           </w:p>
         </w:tc>
@@ -2246,7 +2509,7 @@
                 <w:color w:val="23301F"/>
                 <w:sz w:val="21"/>
               </w:rPr>
-              <w:t>筆者は「想像力の使い方」について、相手の立場や事情を突き詰めて考えるよりも、「いま」を一緒に味わうことに使うべきだと述べている。身体の不自由な子も、男の子も女の子も、年齢も関係なく、みんなで遊べる場をつくっていたという例がそれを示している。</w:t>
+              <w:t>筆者は、相手の立場や事情を突き詰めて考えるよりも、「いま」を一緒に味わうことに想像力を使いたいと述べている。身体の不自由な子も、男の子も女の子も、年齢も関係なく、みんなで遊べるルールをつくっていたという例がそれを示している。</w:t>
             </w:r>
           </w:p>
         </w:tc>
@@ -2345,7 +2608,7 @@
                 <w:color w:val="2C5F2D"/>
                 <w:sz w:val="19"/>
               </w:rPr>
-              <w:t>155字</w:t>
+              <w:t>159字</w:t>
             </w:r>
           </w:p>
         </w:tc>
@@ -2366,7 +2629,7 @@
                 <w:color w:val="23301F"/>
                 <w:sz w:val="21"/>
               </w:rPr>
-              <w:t>一つ目は、子どもにとって大切なのは、違いを意識することより、同じ時間を楽しむ経験だからである。家の宗教や事情を深く考えすぎると、かえって相手との間に壁をつくってしまう。違いがあっても一緒に笑い合えた経験こそが、相手を自然に受け入れる力になると考える。違いへの理解は、一緒に過ごす中で後から育っていくものである。</w:t>
+              <w:t>一つ目は、違いを意識しすぎると、相手との間に壁ができてしまうからである。家の宗教などの事情を深く考えるより、まず一緒に遊ぶ経験こそが、相手を自然に受け入れる力になる。事情を知ることも大切だが、それを理由に距離を置けば、互いを知る機会そのものが失われてしまう。違いへの理解は、一緒に過ごす中で後から育っていくものである。</w:t>
             </w:r>
           </w:p>
         </w:tc>
@@ -2405,7 +2668,7 @@
                 <w:color w:val="2C5F2D"/>
                 <w:sz w:val="19"/>
               </w:rPr>
-              <w:t>136字</w:t>
+              <w:t>171字</w:t>
             </w:r>
           </w:p>
         </w:tc>
@@ -2426,7 +2689,7 @@
                 <w:color w:val="23301F"/>
                 <w:sz w:val="21"/>
               </w:rPr>
-              <w:t>二つ目は、大人の事情を子どもの世界に持ち込むべきではないからである。大人の都合で遊ぶ相手を選ばせれば、子どもは人を立場や属性で判断することを覚えてしまう。子どもが自分で関係を築ける場を守ることが、大人の役割である。大人は口を出すより、遊びの場を整えることに力を注ぐべきだ。</w:t>
+              <w:t>二つ目は、大人の事情が子どもの関係を壊してしまうからである。私が小学生の頃、「あの家には近づいてはいけない、遊んではいけない」と大人が子どもに言ったという話を聞いたことがある。遊びを禁じられた子は、一緒に遊びたかったにもかかわらず、それができなかった。当時の私は、親の宗教のせいで子どもまで巻き込まれるのは、とてもかわいそうで残酷だと感じた。</w:t>
             </w:r>
           </w:p>
         </w:tc>
@@ -2465,7 +2728,7 @@
                 <w:color w:val="2C5F2D"/>
                 <w:sz w:val="19"/>
               </w:rPr>
-              <w:t>118字</w:t>
+              <w:t>92字</w:t>
             </w:r>
           </w:p>
         </w:tc>
@@ -2486,7 +2749,7 @@
                 <w:color w:val="23301F"/>
                 <w:sz w:val="21"/>
               </w:rPr>
-              <w:t>以上より、想像力は相手を分けるためではなく、みんなが一緒に過ごせる「いま」をつくるために使うべきである。私は教育学科で子どもの発達や学級づくりを学び、障害の有無や性別に関係なく、どの子も安心して一緒に過ごせる場をつくれる教員になりたい。</w:t>
+              <w:t>以上より、想像力は相手を分けるためではなく、みんなで「いま」を楽しむために使うべきである。私は教育学科で学び、事情の違いに関係なく、どの子も一緒に過ごせる学級をつくれる教員になりたい。</w:t>
             </w:r>
           </w:p>
         </w:tc>
@@ -2574,7 +2837,7 @@
           <w:color w:val="23301F"/>
           <w:sz w:val="21"/>
         </w:rPr>
-        <w:t>答案には教育への言及がない。教育学科の小論文では「教員としてどう関わるか」「何を学びたいか」を結論に入れることが、学ぶ意欲と学科との適合を示す一番確かな方法である。</w:t>
+        <w:t>体験の題材（大人の事情で子どもが分けられる）は、まさに教育の場で教員が向き合う問題である。結論で「教員として子どもたちをつなぐ」視点を示せば、教育学科で学ぶ意欲がはっきり伝わる。</w:t>
       </w:r>
     </w:p>
     <w:p>
@@ -2634,7 +2897,7 @@
           <w:color w:val="23301F"/>
           <w:sz w:val="21"/>
         </w:rPr>
-        <w:t>どの答案でも、最後に「以上より〜。私は教育学科で〜を学び、〜な教員になりたい」の結論段落を書く</w:t>
+        <w:t>理由は課題文の言い換えでなく、「なぜそう言えるか」を自分の言葉で書く</w:t>
       </w:r>
     </w:p>
     <w:p>
@@ -2657,7 +2920,7 @@
           <w:color w:val="23301F"/>
           <w:sz w:val="21"/>
         </w:rPr>
-        <w:t>理由には自分の体験を一つ入れる（小・中学校、部活動、委員会など）</w:t>
+        <w:t>体験は、それが理由の根拠になるよう、理由のすぐ後に置く</w:t>
       </w:r>
     </w:p>
     <w:p>
@@ -2680,7 +2943,7 @@
           <w:color w:val="23301F"/>
           <w:sz w:val="21"/>
         </w:rPr>
-        <w:t>600字程度なら540字以上を目標に、原稿用紙の2枚目まで書き切る</w:t>
+        <w:t>結論の最後の一文は、教育学科での学び・なりたい教員像につなげる</w:t>
       </w:r>
     </w:p>
     <w:sectPr>

</xml_diff>